<commit_message>
Fix coding labels and overstated results in July 2026 reports
- Key conclusions: appendix Q21/Q23/Q24 renumbered to match the survey coding (1=Nee ... 5=Weet niet); exec summary hornet figure corrected to the 'not seen' group (25.94%).
- Toxicity: honey-only crop diversity table label fixed; honey-only toxicity result reworded (no p < 0.05).

Co-Authored-By: Claude Opus 5.5 (1M context) <noreply@anthropic.com>
Claude-Session: https://claude.ai/code/session_01TLTj776fi2t59FPNJR2gmR
</commit_message>
<xml_diff>
--- a/outputs/Bijensterfte key conclusion 2026_July 2026.docx
+++ b/outputs/Bijensterfte key conclusion 2026_July 2026.docx
@@ -401,7 +401,7 @@
           <w:rFonts w:ascii="Calibri" w:cs="Calibri" w:eastAsia="Calibri" w:hAnsi="Calibri"/>
           <w:rtl w:val="0"/>
         </w:rPr>
-        <w:t xml:space="preserve"> Beekeepers who reported not observing varroa mites or Asian hornets actually experienced the highest colony mortality rates (31.23% and 29.82%, respectively). This suggests that invisible or unnoticed threats are highly damaging.</w:t>
+        <w:t xml:space="preserve"> Beekeepers who reported not observing varroa mites or Asian hornets had higher colony mortality rates (31.23% and 25.94%, respectively) than beekeepers who did observe them. This suggests that unnoticed threats can still be damaging.</w:t>
       </w:r>
     </w:p>
     <w:p>
@@ -6713,36 +6713,152 @@
           <w:rFonts w:ascii="Calibri" w:cs="Calibri" w:eastAsia="Calibri" w:hAnsi="Calibri"/>
           <w:rtl w:val="0"/>
         </w:rPr>
-        <w:t xml:space="preserve">1: Ja, veel</w:t>
-      </w:r>
-    </w:p>
-    <w:p>
-      <w:pPr>
-        <w:keepNext w:val="0"/>
-        <w:keepLines w:val="0"/>
-        <w:pageBreakBefore w:val="0"/>
-        <w:widowControl w:val="1"/>
-        <w:pBdr>
-          <w:top w:space="0" w:sz="0" w:val="nil"/>
-          <w:left w:space="0" w:sz="0" w:val="nil"/>
-          <w:bottom w:space="0" w:sz="0" w:val="nil"/>
-          <w:right w:space="0" w:sz="0" w:val="nil"/>
-          <w:between w:space="0" w:sz="0" w:val="nil"/>
-        </w:pBdr>
-        <w:shd w:fill="auto" w:val="clear"/>
-        <w:spacing w:after="0" w:before="0" w:line="276" w:lineRule="auto"/>
-        <w:ind w:left="0" w:right="0" w:firstLine="0"/>
-        <w:jc w:val="left"/>
-        <w:rPr>
-          <w:rFonts w:ascii="Calibri" w:cs="Calibri" w:eastAsia="Calibri" w:hAnsi="Calibri"/>
-        </w:rPr>
-      </w:pPr>
-      <w:r>
-        <w:rPr>
-          <w:rFonts w:ascii="Calibri" w:cs="Calibri" w:eastAsia="Calibri" w:hAnsi="Calibri"/>
-          <w:rtl w:val="0"/>
-        </w:rPr>
-        <w:t xml:space="preserve">2: Ja, matig</w:t>
+        <w:t>1: Nee, geen varroa waargenomen</w:t>
+      </w:r>
+    </w:p>
+    <w:p>
+      <w:pPr>
+        <w:keepNext w:val="0"/>
+        <w:keepLines w:val="0"/>
+        <w:pageBreakBefore w:val="0"/>
+        <w:widowControl w:val="1"/>
+        <w:pBdr>
+          <w:top w:space="0" w:sz="0" w:val="nil"/>
+          <w:left w:space="0" w:sz="0" w:val="nil"/>
+          <w:bottom w:space="0" w:sz="0" w:val="nil"/>
+          <w:right w:space="0" w:sz="0" w:val="nil"/>
+          <w:between w:space="0" w:sz="0" w:val="nil"/>
+        </w:pBdr>
+        <w:shd w:fill="auto" w:val="clear"/>
+        <w:spacing w:after="0" w:before="0" w:line="276" w:lineRule="auto"/>
+        <w:ind w:left="0" w:right="0" w:firstLine="0"/>
+        <w:jc w:val="left"/>
+        <w:rPr>
+          <w:rFonts w:ascii="Calibri" w:cs="Calibri" w:eastAsia="Calibri" w:hAnsi="Calibri"/>
+        </w:rPr>
+      </w:pPr>
+      <w:r>
+        <w:rPr>
+          <w:rFonts w:ascii="Calibri" w:cs="Calibri" w:eastAsia="Calibri" w:hAnsi="Calibri"/>
+          <w:rtl w:val="0"/>
+        </w:rPr>
+        <w:t>2: Ja, weinig</w:t>
+      </w:r>
+    </w:p>
+    <w:p>
+      <w:pPr>
+        <w:keepNext w:val="0"/>
+        <w:keepLines w:val="0"/>
+        <w:pageBreakBefore w:val="0"/>
+        <w:widowControl w:val="1"/>
+        <w:pBdr>
+          <w:top w:space="0" w:sz="0" w:val="nil"/>
+          <w:left w:space="0" w:sz="0" w:val="nil"/>
+          <w:bottom w:space="0" w:sz="0" w:val="nil"/>
+          <w:right w:space="0" w:sz="0" w:val="nil"/>
+          <w:between w:space="0" w:sz="0" w:val="nil"/>
+        </w:pBdr>
+        <w:shd w:fill="auto" w:val="clear"/>
+        <w:spacing w:after="0" w:before="0" w:line="276" w:lineRule="auto"/>
+        <w:ind w:left="0" w:right="0" w:firstLine="0"/>
+        <w:jc w:val="left"/>
+        <w:rPr>
+          <w:rFonts w:ascii="Calibri" w:cs="Calibri" w:eastAsia="Calibri" w:hAnsi="Calibri"/>
+        </w:rPr>
+      </w:pPr>
+      <w:r>
+        <w:rPr>
+          <w:rFonts w:ascii="Calibri" w:cs="Calibri" w:eastAsia="Calibri" w:hAnsi="Calibri"/>
+          <w:rtl w:val="0"/>
+        </w:rPr>
+        <w:t xml:space="preserve">Uiteraard nog last van mijten, maar onze teelt is volledig gericht op VSH met o.a. KI, waardoor bij 60% van de volken de mijtentelling uit kwam onder 1%</w:t>
+      </w:r>
+    </w:p>
+    <w:p>
+      <w:pPr>
+        <w:keepNext w:val="0"/>
+        <w:keepLines w:val="0"/>
+        <w:pageBreakBefore w:val="0"/>
+        <w:widowControl w:val="1"/>
+        <w:pBdr>
+          <w:top w:space="0" w:sz="0" w:val="nil"/>
+          <w:left w:space="0" w:sz="0" w:val="nil"/>
+          <w:bottom w:space="0" w:sz="0" w:val="nil"/>
+          <w:right w:space="0" w:sz="0" w:val="nil"/>
+          <w:between w:space="0" w:sz="0" w:val="nil"/>
+        </w:pBdr>
+        <w:shd w:fill="auto" w:val="clear"/>
+        <w:spacing w:after="0" w:before="0" w:line="276" w:lineRule="auto"/>
+        <w:ind w:left="0" w:right="0" w:firstLine="0"/>
+        <w:jc w:val="left"/>
+        <w:rPr>
+          <w:rFonts w:ascii="Calibri" w:cs="Calibri" w:eastAsia="Calibri" w:hAnsi="Calibri"/>
+        </w:rPr>
+      </w:pPr>
+      <w:r>
+        <w:rPr>
+          <w:rFonts w:ascii="Calibri" w:cs="Calibri" w:eastAsia="Calibri" w:hAnsi="Calibri"/>
+          <w:rtl w:val="0"/>
+        </w:rPr>
+        <w:t xml:space="preserve">alleen op de varroa lade</w:t>
+      </w:r>
+    </w:p>
+    <w:p>
+      <w:pPr>
+        <w:keepNext w:val="0"/>
+        <w:keepLines w:val="0"/>
+        <w:pageBreakBefore w:val="0"/>
+        <w:widowControl w:val="1"/>
+        <w:pBdr>
+          <w:top w:space="0" w:sz="0" w:val="nil"/>
+          <w:left w:space="0" w:sz="0" w:val="nil"/>
+          <w:bottom w:space="0" w:sz="0" w:val="nil"/>
+          <w:right w:space="0" w:sz="0" w:val="nil"/>
+          <w:between w:space="0" w:sz="0" w:val="nil"/>
+        </w:pBdr>
+        <w:shd w:fill="auto" w:val="clear"/>
+        <w:spacing w:after="0" w:before="0" w:line="276" w:lineRule="auto"/>
+        <w:ind w:left="0" w:right="0" w:firstLine="0"/>
+        <w:jc w:val="left"/>
+        <w:rPr>
+          <w:rFonts w:ascii="Calibri" w:cs="Calibri" w:eastAsia="Calibri" w:hAnsi="Calibri"/>
+        </w:rPr>
+      </w:pPr>
+      <w:r>
+        <w:rPr>
+          <w:rFonts w:ascii="Calibri" w:cs="Calibri" w:eastAsia="Calibri" w:hAnsi="Calibri"/>
+          <w:rtl w:val="0"/>
+        </w:rPr>
+        <w:t xml:space="preserve">Een volk behandeld met mierenzuur en in de herfst alles gesubsidieerd </w:t>
+      </w:r>
+    </w:p>
+    <w:p>
+      <w:pPr>
+        <w:keepNext w:val="0"/>
+        <w:keepLines w:val="0"/>
+        <w:pageBreakBefore w:val="0"/>
+        <w:widowControl w:val="1"/>
+        <w:pBdr>
+          <w:top w:space="0" w:sz="0" w:val="nil"/>
+          <w:left w:space="0" w:sz="0" w:val="nil"/>
+          <w:bottom w:space="0" w:sz="0" w:val="nil"/>
+          <w:right w:space="0" w:sz="0" w:val="nil"/>
+          <w:between w:space="0" w:sz="0" w:val="nil"/>
+        </w:pBdr>
+        <w:shd w:fill="auto" w:val="clear"/>
+        <w:spacing w:after="0" w:before="0" w:line="276" w:lineRule="auto"/>
+        <w:ind w:left="0" w:right="0" w:firstLine="0"/>
+        <w:jc w:val="left"/>
+        <w:rPr>
+          <w:rFonts w:ascii="Calibri" w:cs="Calibri" w:eastAsia="Calibri" w:hAnsi="Calibri"/>
+        </w:rPr>
+      </w:pPr>
+      <w:r>
+        <w:rPr>
+          <w:rFonts w:ascii="Calibri" w:cs="Calibri" w:eastAsia="Calibri" w:hAnsi="Calibri"/>
+          <w:rtl w:val="0"/>
+        </w:rPr>
+        <w:t>3: Ja, matig</w:t>
       </w:r>
     </w:p>
     <w:p>
@@ -6858,152 +6974,36 @@
           <w:rFonts w:ascii="Calibri" w:cs="Calibri" w:eastAsia="Calibri" w:hAnsi="Calibri"/>
           <w:rtl w:val="0"/>
         </w:rPr>
-        <w:t xml:space="preserve">3: Ja, weinig</w:t>
-      </w:r>
-    </w:p>
-    <w:p>
-      <w:pPr>
-        <w:keepNext w:val="0"/>
-        <w:keepLines w:val="0"/>
-        <w:pageBreakBefore w:val="0"/>
-        <w:widowControl w:val="1"/>
-        <w:pBdr>
-          <w:top w:space="0" w:sz="0" w:val="nil"/>
-          <w:left w:space="0" w:sz="0" w:val="nil"/>
-          <w:bottom w:space="0" w:sz="0" w:val="nil"/>
-          <w:right w:space="0" w:sz="0" w:val="nil"/>
-          <w:between w:space="0" w:sz="0" w:val="nil"/>
-        </w:pBdr>
-        <w:shd w:fill="auto" w:val="clear"/>
-        <w:spacing w:after="0" w:before="0" w:line="276" w:lineRule="auto"/>
-        <w:ind w:left="0" w:right="0" w:firstLine="0"/>
-        <w:jc w:val="left"/>
-        <w:rPr>
-          <w:rFonts w:ascii="Calibri" w:cs="Calibri" w:eastAsia="Calibri" w:hAnsi="Calibri"/>
-        </w:rPr>
-      </w:pPr>
-      <w:r>
-        <w:rPr>
-          <w:rFonts w:ascii="Calibri" w:cs="Calibri" w:eastAsia="Calibri" w:hAnsi="Calibri"/>
-          <w:rtl w:val="0"/>
-        </w:rPr>
-        <w:t xml:space="preserve">Uiteraard nog last van mijten, maar onze teelt is volledig gericht op VSH met o.a. KI, waardoor bij 60% van de volken de mijtentelling uit kwam onder 1%</w:t>
-      </w:r>
-    </w:p>
-    <w:p>
-      <w:pPr>
-        <w:keepNext w:val="0"/>
-        <w:keepLines w:val="0"/>
-        <w:pageBreakBefore w:val="0"/>
-        <w:widowControl w:val="1"/>
-        <w:pBdr>
-          <w:top w:space="0" w:sz="0" w:val="nil"/>
-          <w:left w:space="0" w:sz="0" w:val="nil"/>
-          <w:bottom w:space="0" w:sz="0" w:val="nil"/>
-          <w:right w:space="0" w:sz="0" w:val="nil"/>
-          <w:between w:space="0" w:sz="0" w:val="nil"/>
-        </w:pBdr>
-        <w:shd w:fill="auto" w:val="clear"/>
-        <w:spacing w:after="0" w:before="0" w:line="276" w:lineRule="auto"/>
-        <w:ind w:left="0" w:right="0" w:firstLine="0"/>
-        <w:jc w:val="left"/>
-        <w:rPr>
-          <w:rFonts w:ascii="Calibri" w:cs="Calibri" w:eastAsia="Calibri" w:hAnsi="Calibri"/>
-        </w:rPr>
-      </w:pPr>
-      <w:r>
-        <w:rPr>
-          <w:rFonts w:ascii="Calibri" w:cs="Calibri" w:eastAsia="Calibri" w:hAnsi="Calibri"/>
-          <w:rtl w:val="0"/>
-        </w:rPr>
-        <w:t xml:space="preserve">alleen op de varroa lade</w:t>
-      </w:r>
-    </w:p>
-    <w:p>
-      <w:pPr>
-        <w:keepNext w:val="0"/>
-        <w:keepLines w:val="0"/>
-        <w:pageBreakBefore w:val="0"/>
-        <w:widowControl w:val="1"/>
-        <w:pBdr>
-          <w:top w:space="0" w:sz="0" w:val="nil"/>
-          <w:left w:space="0" w:sz="0" w:val="nil"/>
-          <w:bottom w:space="0" w:sz="0" w:val="nil"/>
-          <w:right w:space="0" w:sz="0" w:val="nil"/>
-          <w:between w:space="0" w:sz="0" w:val="nil"/>
-        </w:pBdr>
-        <w:shd w:fill="auto" w:val="clear"/>
-        <w:spacing w:after="0" w:before="0" w:line="276" w:lineRule="auto"/>
-        <w:ind w:left="0" w:right="0" w:firstLine="0"/>
-        <w:jc w:val="left"/>
-        <w:rPr>
-          <w:rFonts w:ascii="Calibri" w:cs="Calibri" w:eastAsia="Calibri" w:hAnsi="Calibri"/>
-        </w:rPr>
-      </w:pPr>
-      <w:r>
-        <w:rPr>
-          <w:rFonts w:ascii="Calibri" w:cs="Calibri" w:eastAsia="Calibri" w:hAnsi="Calibri"/>
-          <w:rtl w:val="0"/>
-        </w:rPr>
-        <w:t xml:space="preserve">Een volk behandeld met mierenzuur en in de herfst alles gesubsidieerd </w:t>
-      </w:r>
-    </w:p>
-    <w:p>
-      <w:pPr>
-        <w:keepNext w:val="0"/>
-        <w:keepLines w:val="0"/>
-        <w:pageBreakBefore w:val="0"/>
-        <w:widowControl w:val="1"/>
-        <w:pBdr>
-          <w:top w:space="0" w:sz="0" w:val="nil"/>
-          <w:left w:space="0" w:sz="0" w:val="nil"/>
-          <w:bottom w:space="0" w:sz="0" w:val="nil"/>
-          <w:right w:space="0" w:sz="0" w:val="nil"/>
-          <w:between w:space="0" w:sz="0" w:val="nil"/>
-        </w:pBdr>
-        <w:shd w:fill="auto" w:val="clear"/>
-        <w:spacing w:after="0" w:before="0" w:line="276" w:lineRule="auto"/>
-        <w:ind w:left="0" w:right="0" w:firstLine="0"/>
-        <w:jc w:val="left"/>
-        <w:rPr>
-          <w:rFonts w:ascii="Calibri" w:cs="Calibri" w:eastAsia="Calibri" w:hAnsi="Calibri"/>
-        </w:rPr>
-      </w:pPr>
-      <w:r>
-        <w:rPr>
-          <w:rFonts w:ascii="Calibri" w:cs="Calibri" w:eastAsia="Calibri" w:hAnsi="Calibri"/>
-          <w:rtl w:val="0"/>
-        </w:rPr>
-        <w:t xml:space="preserve">4: Nee, geen varroa waargenomen</w:t>
-      </w:r>
-    </w:p>
-    <w:p>
-      <w:pPr>
-        <w:keepNext w:val="0"/>
-        <w:keepLines w:val="0"/>
-        <w:pageBreakBefore w:val="0"/>
-        <w:widowControl w:val="1"/>
-        <w:pBdr>
-          <w:top w:space="0" w:sz="0" w:val="nil"/>
-          <w:left w:space="0" w:sz="0" w:val="nil"/>
-          <w:bottom w:space="0" w:sz="0" w:val="nil"/>
-          <w:right w:space="0" w:sz="0" w:val="nil"/>
-          <w:between w:space="0" w:sz="0" w:val="nil"/>
-        </w:pBdr>
-        <w:shd w:fill="auto" w:val="clear"/>
-        <w:spacing w:after="0" w:before="0" w:line="276" w:lineRule="auto"/>
-        <w:ind w:left="0" w:right="0" w:firstLine="0"/>
-        <w:jc w:val="left"/>
-        <w:rPr>
-          <w:rFonts w:ascii="Calibri" w:cs="Calibri" w:eastAsia="Calibri" w:hAnsi="Calibri"/>
-        </w:rPr>
-      </w:pPr>
-      <w:r>
-        <w:rPr>
-          <w:rFonts w:ascii="Calibri" w:cs="Calibri" w:eastAsia="Calibri" w:hAnsi="Calibri"/>
-          <w:rtl w:val="0"/>
-        </w:rPr>
-        <w:t xml:space="preserve">5: Weet ik niet, ik heb er niet op gelet</w:t>
+        <w:t>4: Ja, veel</w:t>
+      </w:r>
+    </w:p>
+    <w:p>
+      <w:pPr>
+        <w:keepNext w:val="0"/>
+        <w:keepLines w:val="0"/>
+        <w:pageBreakBefore w:val="0"/>
+        <w:widowControl w:val="1"/>
+        <w:pBdr>
+          <w:top w:space="0" w:sz="0" w:val="nil"/>
+          <w:left w:space="0" w:sz="0" w:val="nil"/>
+          <w:bottom w:space="0" w:sz="0" w:val="nil"/>
+          <w:right w:space="0" w:sz="0" w:val="nil"/>
+          <w:between w:space="0" w:sz="0" w:val="nil"/>
+        </w:pBdr>
+        <w:shd w:fill="auto" w:val="clear"/>
+        <w:spacing w:after="0" w:before="0" w:line="276" w:lineRule="auto"/>
+        <w:ind w:left="0" w:right="0" w:firstLine="0"/>
+        <w:jc w:val="left"/>
+        <w:rPr>
+          <w:rFonts w:ascii="Calibri" w:cs="Calibri" w:eastAsia="Calibri" w:hAnsi="Calibri"/>
+        </w:rPr>
+      </w:pPr>
+      <w:r>
+        <w:rPr>
+          <w:rFonts w:ascii="Calibri" w:cs="Calibri" w:eastAsia="Calibri" w:hAnsi="Calibri"/>
+          <w:rtl w:val="0"/>
+        </w:rPr>
+        <w:t>5: Weet ik niet, ik heb er niet op gelet</w:t>
       </w:r>
     </w:p>
     <w:p>
@@ -7418,16 +7418,132 @@
           <w:rFonts w:ascii="Calibri" w:cs="Calibri" w:eastAsia="Calibri" w:hAnsi="Calibri"/>
           <w:rtl w:val="0"/>
         </w:rPr>
-        <w:t xml:space="preserve">1: </w:t>
-      </w:r>
-      <w:r>
-        <w:rPr>
-          <w:rFonts w:ascii="Calibri" w:cs="Calibri" w:eastAsia="Calibri" w:hAnsi="Calibri"/>
-          <w:b w:val="1"/>
-          <w:bCs w:val="1"/>
-          <w:rtl w:val="0"/>
-        </w:rPr>
-        <w:t xml:space="preserve">Ja veel, er zijn er vaak meer dan 3 voor de kast te zien</w:t>
+        <w:t>1:</w:t>
+      </w:r>
+      <w:r>
+        <w:rPr>
+          <w:rFonts w:ascii="Calibri" w:cs="Calibri" w:eastAsia="Calibri" w:hAnsi="Calibri"/>
+          <w:b w:val="1"/>
+          <w:bCs w:val="1"/>
+          <w:rtl w:val="0"/>
+        </w:rPr>
+        <w:t xml:space="preserve"> Nee, geen Aziatische hoornaar waargenomen</w:t>
+      </w:r>
+    </w:p>
+    <w:p>
+      <w:pPr>
+        <w:keepNext w:val="0"/>
+        <w:keepLines w:val="0"/>
+        <w:pageBreakBefore w:val="0"/>
+        <w:widowControl w:val="1"/>
+        <w:pBdr>
+          <w:top w:space="0" w:sz="0" w:val="nil"/>
+          <w:left w:space="0" w:sz="0" w:val="nil"/>
+          <w:bottom w:space="0" w:sz="0" w:val="nil"/>
+          <w:right w:space="0" w:sz="0" w:val="nil"/>
+          <w:between w:space="0" w:sz="0" w:val="nil"/>
+        </w:pBdr>
+        <w:shd w:fill="auto" w:val="clear"/>
+        <w:spacing w:after="0" w:before="0" w:line="276" w:lineRule="auto"/>
+        <w:ind w:left="0" w:right="0" w:firstLine="0"/>
+        <w:jc w:val="left"/>
+        <w:rPr>
+          <w:rFonts w:ascii="Calibri" w:cs="Calibri" w:eastAsia="Calibri" w:hAnsi="Calibri"/>
+        </w:rPr>
+      </w:pPr>
+      <w:r>
+        <w:rPr>
+          <w:rFonts w:ascii="Calibri" w:cs="Calibri" w:eastAsia="Calibri" w:hAnsi="Calibri"/>
+          <w:rtl w:val="0"/>
+        </w:rPr>
+        <w:t xml:space="preserve">Veel wespen, hommelnest, Hoornaar gezien (kon niet zien of deze Europees of Aziatisch was.)</w:t>
+      </w:r>
+    </w:p>
+    <w:p>
+      <w:pPr>
+        <w:keepNext w:val="0"/>
+        <w:keepLines w:val="0"/>
+        <w:pageBreakBefore w:val="0"/>
+        <w:widowControl w:val="1"/>
+        <w:pBdr>
+          <w:top w:space="0" w:sz="0" w:val="nil"/>
+          <w:left w:space="0" w:sz="0" w:val="nil"/>
+          <w:bottom w:space="0" w:sz="0" w:val="nil"/>
+          <w:right w:space="0" w:sz="0" w:val="nil"/>
+          <w:between w:space="0" w:sz="0" w:val="nil"/>
+        </w:pBdr>
+        <w:shd w:fill="auto" w:val="clear"/>
+        <w:spacing w:after="0" w:before="0" w:line="276" w:lineRule="auto"/>
+        <w:ind w:left="0" w:right="0" w:firstLine="0"/>
+        <w:jc w:val="left"/>
+        <w:rPr>
+          <w:rFonts w:ascii="Calibri" w:cs="Calibri" w:eastAsia="Calibri" w:hAnsi="Calibri"/>
+        </w:rPr>
+      </w:pPr>
+      <w:r>
+        <w:rPr>
+          <w:rFonts w:ascii="Calibri" w:cs="Calibri" w:eastAsia="Calibri" w:hAnsi="Calibri"/>
+          <w:rtl w:val="0"/>
+        </w:rPr>
+        <w:t xml:space="preserve">Wel veel Europese Hoornaars die bijen pakten</w:t>
+      </w:r>
+    </w:p>
+    <w:p>
+      <w:pPr>
+        <w:keepNext w:val="0"/>
+        <w:keepLines w:val="0"/>
+        <w:pageBreakBefore w:val="0"/>
+        <w:widowControl w:val="1"/>
+        <w:pBdr>
+          <w:top w:space="0" w:sz="0" w:val="nil"/>
+          <w:left w:space="0" w:sz="0" w:val="nil"/>
+          <w:bottom w:space="0" w:sz="0" w:val="nil"/>
+          <w:right w:space="0" w:sz="0" w:val="nil"/>
+          <w:between w:space="0" w:sz="0" w:val="nil"/>
+        </w:pBdr>
+        <w:shd w:fill="auto" w:val="clear"/>
+        <w:spacing w:after="0" w:before="0" w:line="276" w:lineRule="auto"/>
+        <w:ind w:left="0" w:right="0" w:firstLine="0"/>
+        <w:jc w:val="left"/>
+        <w:rPr>
+          <w:rFonts w:ascii="Calibri" w:cs="Calibri" w:eastAsia="Calibri" w:hAnsi="Calibri"/>
+        </w:rPr>
+      </w:pPr>
+      <w:r>
+        <w:rPr>
+          <w:rFonts w:ascii="Calibri" w:cs="Calibri" w:eastAsia="Calibri" w:hAnsi="Calibri"/>
+          <w:rtl w:val="0"/>
+        </w:rPr>
+        <w:t xml:space="preserve">niet direct bijh het volg zelf AG gezien, maar er waren waarnemingen in de omgeving</w:t>
+      </w:r>
+    </w:p>
+    <w:p>
+      <w:pPr>
+        <w:keepNext w:val="0"/>
+        <w:keepLines w:val="0"/>
+        <w:pageBreakBefore w:val="0"/>
+        <w:widowControl w:val="1"/>
+        <w:pBdr>
+          <w:top w:space="0" w:sz="0" w:val="nil"/>
+          <w:left w:space="0" w:sz="0" w:val="nil"/>
+          <w:bottom w:space="0" w:sz="0" w:val="nil"/>
+          <w:right w:space="0" w:sz="0" w:val="nil"/>
+          <w:between w:space="0" w:sz="0" w:val="nil"/>
+        </w:pBdr>
+        <w:shd w:fill="auto" w:val="clear"/>
+        <w:spacing w:after="0" w:before="0" w:line="276" w:lineRule="auto"/>
+        <w:ind w:left="0" w:right="0" w:firstLine="0"/>
+        <w:jc w:val="left"/>
+        <w:rPr>
+          <w:rFonts w:ascii="Calibri" w:cs="Calibri" w:eastAsia="Calibri" w:hAnsi="Calibri"/>
+        </w:rPr>
+      </w:pPr>
+      <w:r>
+        <w:rPr>
+          <w:rFonts w:ascii="Calibri" w:cs="Calibri" w:eastAsia="Calibri" w:hAnsi="Calibri"/>
+          <w:rtl w:val="0"/>
+        </w:rPr>
+        <w:t xml:space="preserve">Dit jaar voor het eerst veel last van actief prederende Europese hoornaars</w:t>
       </w:r>
     </w:p>
     <w:p>
@@ -7459,46 +7575,6 @@
           <w:rtl w:val="0"/>
         </w:rPr>
         <w:t xml:space="preserve">2: </w:t>
-      </w:r>
-      <w:r>
-        <w:rPr>
-          <w:rFonts w:ascii="Calibri" w:cs="Calibri" w:eastAsia="Calibri" w:hAnsi="Calibri"/>
-          <w:b w:val="1"/>
-          <w:bCs w:val="1"/>
-          <w:rtl w:val="0"/>
-        </w:rPr>
-        <w:t xml:space="preserve">Ja matig, vaak minstens 1 voor de kast</w:t>
-      </w:r>
-    </w:p>
-    <w:p>
-      <w:pPr>
-        <w:keepNext w:val="0"/>
-        <w:keepLines w:val="0"/>
-        <w:pageBreakBefore w:val="0"/>
-        <w:widowControl w:val="1"/>
-        <w:pBdr>
-          <w:top w:space="0" w:sz="0" w:val="nil"/>
-          <w:left w:space="0" w:sz="0" w:val="nil"/>
-          <w:bottom w:space="0" w:sz="0" w:val="nil"/>
-          <w:right w:space="0" w:sz="0" w:val="nil"/>
-          <w:between w:space="0" w:sz="0" w:val="nil"/>
-        </w:pBdr>
-        <w:shd w:fill="auto" w:val="clear"/>
-        <w:spacing w:after="0" w:before="0" w:line="276" w:lineRule="auto"/>
-        <w:ind w:left="0" w:right="0" w:firstLine="0"/>
-        <w:jc w:val="left"/>
-        <w:rPr>
-          <w:rFonts w:ascii="Calibri" w:cs="Calibri" w:eastAsia="Calibri" w:hAnsi="Calibri"/>
-          <w:b w:val="1"/>
-          <w:bCs w:val="1"/>
-        </w:rPr>
-      </w:pPr>
-      <w:r>
-        <w:rPr>
-          <w:rFonts w:ascii="Calibri" w:cs="Calibri" w:eastAsia="Calibri" w:hAnsi="Calibri"/>
-          <w:rtl w:val="0"/>
-        </w:rPr>
-        <w:t xml:space="preserve">3: </w:t>
       </w:r>
       <w:r>
         <w:rPr>
@@ -7786,132 +7862,56 @@
           <w:rFonts w:ascii="Calibri" w:cs="Calibri" w:eastAsia="Calibri" w:hAnsi="Calibri"/>
           <w:rtl w:val="0"/>
         </w:rPr>
-        <w:t xml:space="preserve">4:</w:t>
-      </w:r>
-      <w:r>
-        <w:rPr>
-          <w:rFonts w:ascii="Calibri" w:cs="Calibri" w:eastAsia="Calibri" w:hAnsi="Calibri"/>
-          <w:b w:val="1"/>
-          <w:bCs w:val="1"/>
-          <w:rtl w:val="0"/>
-        </w:rPr>
-        <w:t xml:space="preserve"> Nee, geen Aziatische hoornaar waargenomen</w:t>
-      </w:r>
-    </w:p>
-    <w:p>
-      <w:pPr>
-        <w:keepNext w:val="0"/>
-        <w:keepLines w:val="0"/>
-        <w:pageBreakBefore w:val="0"/>
-        <w:widowControl w:val="1"/>
-        <w:pBdr>
-          <w:top w:space="0" w:sz="0" w:val="nil"/>
-          <w:left w:space="0" w:sz="0" w:val="nil"/>
-          <w:bottom w:space="0" w:sz="0" w:val="nil"/>
-          <w:right w:space="0" w:sz="0" w:val="nil"/>
-          <w:between w:space="0" w:sz="0" w:val="nil"/>
-        </w:pBdr>
-        <w:shd w:fill="auto" w:val="clear"/>
-        <w:spacing w:after="0" w:before="0" w:line="276" w:lineRule="auto"/>
-        <w:ind w:left="0" w:right="0" w:firstLine="0"/>
-        <w:jc w:val="left"/>
-        <w:rPr>
-          <w:rFonts w:ascii="Calibri" w:cs="Calibri" w:eastAsia="Calibri" w:hAnsi="Calibri"/>
-        </w:rPr>
-      </w:pPr>
-      <w:r>
-        <w:rPr>
-          <w:rFonts w:ascii="Calibri" w:cs="Calibri" w:eastAsia="Calibri" w:hAnsi="Calibri"/>
-          <w:rtl w:val="0"/>
-        </w:rPr>
-        <w:t xml:space="preserve">Veel wespen, hommelnest, Hoornaar gezien (kon niet zien of deze Europees of Aziatisch was.)</w:t>
-      </w:r>
-    </w:p>
-    <w:p>
-      <w:pPr>
-        <w:keepNext w:val="0"/>
-        <w:keepLines w:val="0"/>
-        <w:pageBreakBefore w:val="0"/>
-        <w:widowControl w:val="1"/>
-        <w:pBdr>
-          <w:top w:space="0" w:sz="0" w:val="nil"/>
-          <w:left w:space="0" w:sz="0" w:val="nil"/>
-          <w:bottom w:space="0" w:sz="0" w:val="nil"/>
-          <w:right w:space="0" w:sz="0" w:val="nil"/>
-          <w:between w:space="0" w:sz="0" w:val="nil"/>
-        </w:pBdr>
-        <w:shd w:fill="auto" w:val="clear"/>
-        <w:spacing w:after="0" w:before="0" w:line="276" w:lineRule="auto"/>
-        <w:ind w:left="0" w:right="0" w:firstLine="0"/>
-        <w:jc w:val="left"/>
-        <w:rPr>
-          <w:rFonts w:ascii="Calibri" w:cs="Calibri" w:eastAsia="Calibri" w:hAnsi="Calibri"/>
-        </w:rPr>
-      </w:pPr>
-      <w:r>
-        <w:rPr>
-          <w:rFonts w:ascii="Calibri" w:cs="Calibri" w:eastAsia="Calibri" w:hAnsi="Calibri"/>
-          <w:rtl w:val="0"/>
-        </w:rPr>
-        <w:t xml:space="preserve">Wel veel Europese Hoornaars die bijen pakten</w:t>
-      </w:r>
-    </w:p>
-    <w:p>
-      <w:pPr>
-        <w:keepNext w:val="0"/>
-        <w:keepLines w:val="0"/>
-        <w:pageBreakBefore w:val="0"/>
-        <w:widowControl w:val="1"/>
-        <w:pBdr>
-          <w:top w:space="0" w:sz="0" w:val="nil"/>
-          <w:left w:space="0" w:sz="0" w:val="nil"/>
-          <w:bottom w:space="0" w:sz="0" w:val="nil"/>
-          <w:right w:space="0" w:sz="0" w:val="nil"/>
-          <w:between w:space="0" w:sz="0" w:val="nil"/>
-        </w:pBdr>
-        <w:shd w:fill="auto" w:val="clear"/>
-        <w:spacing w:after="0" w:before="0" w:line="276" w:lineRule="auto"/>
-        <w:ind w:left="0" w:right="0" w:firstLine="0"/>
-        <w:jc w:val="left"/>
-        <w:rPr>
-          <w:rFonts w:ascii="Calibri" w:cs="Calibri" w:eastAsia="Calibri" w:hAnsi="Calibri"/>
-        </w:rPr>
-      </w:pPr>
-      <w:r>
-        <w:rPr>
-          <w:rFonts w:ascii="Calibri" w:cs="Calibri" w:eastAsia="Calibri" w:hAnsi="Calibri"/>
-          <w:rtl w:val="0"/>
-        </w:rPr>
-        <w:t xml:space="preserve">niet direct bijh het volg zelf AG gezien, maar er waren waarnemingen in de omgeving</w:t>
-      </w:r>
-    </w:p>
-    <w:p>
-      <w:pPr>
-        <w:keepNext w:val="0"/>
-        <w:keepLines w:val="0"/>
-        <w:pageBreakBefore w:val="0"/>
-        <w:widowControl w:val="1"/>
-        <w:pBdr>
-          <w:top w:space="0" w:sz="0" w:val="nil"/>
-          <w:left w:space="0" w:sz="0" w:val="nil"/>
-          <w:bottom w:space="0" w:sz="0" w:val="nil"/>
-          <w:right w:space="0" w:sz="0" w:val="nil"/>
-          <w:between w:space="0" w:sz="0" w:val="nil"/>
-        </w:pBdr>
-        <w:shd w:fill="auto" w:val="clear"/>
-        <w:spacing w:after="0" w:before="0" w:line="276" w:lineRule="auto"/>
-        <w:ind w:left="0" w:right="0" w:firstLine="0"/>
-        <w:jc w:val="left"/>
-        <w:rPr>
-          <w:rFonts w:ascii="Calibri" w:cs="Calibri" w:eastAsia="Calibri" w:hAnsi="Calibri"/>
-        </w:rPr>
-      </w:pPr>
-      <w:r>
-        <w:rPr>
-          <w:rFonts w:ascii="Calibri" w:cs="Calibri" w:eastAsia="Calibri" w:hAnsi="Calibri"/>
-          <w:rtl w:val="0"/>
-        </w:rPr>
-        <w:t xml:space="preserve">Dit jaar voor het eerst veel last van actief prederende Europese hoornaars</w:t>
+        <w:t xml:space="preserve">3: </w:t>
+      </w:r>
+      <w:r>
+        <w:rPr>
+          <w:rFonts w:ascii="Calibri" w:cs="Calibri" w:eastAsia="Calibri" w:hAnsi="Calibri"/>
+          <w:b w:val="1"/>
+          <w:bCs w:val="1"/>
+          <w:rtl w:val="0"/>
+        </w:rPr>
+        <w:t xml:space="preserve">Ja matig, vaak minstens 1 voor de kast</w:t>
+      </w:r>
+    </w:p>
+    <w:p>
+      <w:pPr>
+        <w:keepNext w:val="0"/>
+        <w:keepLines w:val="0"/>
+        <w:pageBreakBefore w:val="0"/>
+        <w:widowControl w:val="1"/>
+        <w:pBdr>
+          <w:top w:space="0" w:sz="0" w:val="nil"/>
+          <w:left w:space="0" w:sz="0" w:val="nil"/>
+          <w:bottom w:space="0" w:sz="0" w:val="nil"/>
+          <w:right w:space="0" w:sz="0" w:val="nil"/>
+          <w:between w:space="0" w:sz="0" w:val="nil"/>
+        </w:pBdr>
+        <w:shd w:fill="auto" w:val="clear"/>
+        <w:spacing w:after="0" w:before="0" w:line="276" w:lineRule="auto"/>
+        <w:ind w:left="0" w:right="0" w:firstLine="0"/>
+        <w:jc w:val="left"/>
+        <w:rPr>
+          <w:rFonts w:ascii="Calibri" w:cs="Calibri" w:eastAsia="Calibri" w:hAnsi="Calibri"/>
+          <w:b w:val="1"/>
+          <w:bCs w:val="1"/>
+        </w:rPr>
+      </w:pPr>
+      <w:r>
+        <w:rPr>
+          <w:rFonts w:ascii="Calibri" w:cs="Calibri" w:eastAsia="Calibri" w:hAnsi="Calibri"/>
+          <w:rtl w:val="0"/>
+        </w:rPr>
+        <w:t xml:space="preserve">4: </w:t>
+      </w:r>
+      <w:r>
+        <w:rPr>
+          <w:rFonts w:ascii="Calibri" w:cs="Calibri" w:eastAsia="Calibri" w:hAnsi="Calibri"/>
+          <w:b w:val="1"/>
+          <w:bCs w:val="1"/>
+          <w:rtl w:val="0"/>
+        </w:rPr>
+        <w:t xml:space="preserve">Ja veel, er zijn er vaak meer dan 3 voor de kast te zien</w:t>
       </w:r>
     </w:p>
     <w:p>
@@ -8123,7 +8123,127 @@
           <w:rFonts w:ascii="Calibri" w:cs="Calibri" w:eastAsia="Calibri" w:hAnsi="Calibri"/>
           <w:rtl w:val="0"/>
         </w:rPr>
-        <w:t xml:space="preserve">1:</w:t>
+        <w:t xml:space="preserve">1: </w:t>
+      </w:r>
+      <w:r>
+        <w:rPr>
+          <w:rFonts w:ascii="Calibri" w:cs="Calibri" w:eastAsia="Calibri" w:hAnsi="Calibri"/>
+          <w:b w:val="1"/>
+          <w:bCs w:val="1"/>
+          <w:rtl w:val="0"/>
+        </w:rPr>
+        <w:t xml:space="preserve">Nee, geen deformed wings waargenomen</w:t>
+      </w:r>
+    </w:p>
+    <w:p>
+      <w:pPr>
+        <w:keepNext w:val="0"/>
+        <w:keepLines w:val="0"/>
+        <w:pageBreakBefore w:val="0"/>
+        <w:widowControl w:val="1"/>
+        <w:pBdr>
+          <w:top w:space="0" w:sz="0" w:val="nil"/>
+          <w:left w:space="0" w:sz="0" w:val="nil"/>
+          <w:bottom w:space="0" w:sz="0" w:val="nil"/>
+          <w:right w:space="0" w:sz="0" w:val="nil"/>
+          <w:between w:space="0" w:sz="0" w:val="nil"/>
+        </w:pBdr>
+        <w:shd w:fill="auto" w:val="clear"/>
+        <w:spacing w:after="0" w:before="0" w:line="276" w:lineRule="auto"/>
+        <w:ind w:left="0" w:right="0" w:firstLine="0"/>
+        <w:jc w:val="left"/>
+        <w:rPr>
+          <w:rFonts w:ascii="Calibri" w:cs="Calibri" w:eastAsia="Calibri" w:hAnsi="Calibri"/>
+          <w:b w:val="1"/>
+          <w:bCs w:val="1"/>
+        </w:rPr>
+      </w:pPr>
+      <w:r>
+        <w:rPr>
+          <w:rFonts w:ascii="Calibri" w:cs="Calibri" w:eastAsia="Calibri" w:hAnsi="Calibri"/>
+          <w:rtl w:val="0"/>
+        </w:rPr>
+        <w:t xml:space="preserve">2: </w:t>
+      </w:r>
+      <w:r>
+        <w:rPr>
+          <w:rFonts w:ascii="Calibri" w:cs="Calibri" w:eastAsia="Calibri" w:hAnsi="Calibri"/>
+          <w:b w:val="1"/>
+          <w:bCs w:val="1"/>
+          <w:rtl w:val="0"/>
+        </w:rPr>
+        <w:t xml:space="preserve">Ja, weinig</w:t>
+      </w:r>
+    </w:p>
+    <w:p>
+      <w:pPr>
+        <w:keepNext w:val="0"/>
+        <w:keepLines w:val="0"/>
+        <w:pageBreakBefore w:val="0"/>
+        <w:widowControl w:val="1"/>
+        <w:pBdr>
+          <w:top w:space="0" w:sz="0" w:val="nil"/>
+          <w:left w:space="0" w:sz="0" w:val="nil"/>
+          <w:bottom w:space="0" w:sz="0" w:val="nil"/>
+          <w:right w:space="0" w:sz="0" w:val="nil"/>
+          <w:between w:space="0" w:sz="0" w:val="nil"/>
+        </w:pBdr>
+        <w:shd w:fill="auto" w:val="clear"/>
+        <w:spacing w:after="0" w:before="0" w:line="276" w:lineRule="auto"/>
+        <w:ind w:left="0" w:right="0" w:firstLine="0"/>
+        <w:jc w:val="left"/>
+        <w:rPr>
+          <w:rFonts w:ascii="Calibri" w:cs="Calibri" w:eastAsia="Calibri" w:hAnsi="Calibri"/>
+          <w:b w:val="1"/>
+          <w:bCs w:val="1"/>
+        </w:rPr>
+      </w:pPr>
+      <w:r>
+        <w:rPr>
+          <w:rFonts w:ascii="Calibri" w:cs="Calibri" w:eastAsia="Calibri" w:hAnsi="Calibri"/>
+          <w:rtl w:val="0"/>
+        </w:rPr>
+        <w:t xml:space="preserve">3: </w:t>
+      </w:r>
+      <w:r>
+        <w:rPr>
+          <w:rFonts w:ascii="Calibri" w:cs="Calibri" w:eastAsia="Calibri" w:hAnsi="Calibri"/>
+          <w:b w:val="1"/>
+          <w:bCs w:val="1"/>
+          <w:rtl w:val="0"/>
+        </w:rPr>
+        <w:t xml:space="preserve">Ja, matig</w:t>
+      </w:r>
+    </w:p>
+    <w:p>
+      <w:pPr>
+        <w:keepNext w:val="0"/>
+        <w:keepLines w:val="0"/>
+        <w:pageBreakBefore w:val="0"/>
+        <w:widowControl w:val="1"/>
+        <w:pBdr>
+          <w:top w:space="0" w:sz="0" w:val="nil"/>
+          <w:left w:space="0" w:sz="0" w:val="nil"/>
+          <w:bottom w:space="0" w:sz="0" w:val="nil"/>
+          <w:right w:space="0" w:sz="0" w:val="nil"/>
+          <w:between w:space="0" w:sz="0" w:val="nil"/>
+        </w:pBdr>
+        <w:shd w:fill="auto" w:val="clear"/>
+        <w:spacing w:after="0" w:before="0" w:line="276" w:lineRule="auto"/>
+        <w:ind w:left="0" w:right="0" w:firstLine="0"/>
+        <w:jc w:val="left"/>
+        <w:rPr>
+          <w:rFonts w:ascii="Calibri" w:cs="Calibri" w:eastAsia="Calibri" w:hAnsi="Calibri"/>
+          <w:b w:val="1"/>
+          <w:bCs w:val="1"/>
+        </w:rPr>
+      </w:pPr>
+      <w:r>
+        <w:rPr>
+          <w:rFonts w:ascii="Calibri" w:cs="Calibri" w:eastAsia="Calibri" w:hAnsi="Calibri"/>
+          <w:rtl w:val="0"/>
+        </w:rPr>
+        <w:t>4:</w:t>
       </w:r>
       <w:r>
         <w:rPr>
@@ -8133,126 +8253,6 @@
           <w:rtl w:val="0"/>
         </w:rPr>
         <w:t xml:space="preserve"> Ja, veel</w:t>
-      </w:r>
-    </w:p>
-    <w:p>
-      <w:pPr>
-        <w:keepNext w:val="0"/>
-        <w:keepLines w:val="0"/>
-        <w:pageBreakBefore w:val="0"/>
-        <w:widowControl w:val="1"/>
-        <w:pBdr>
-          <w:top w:space="0" w:sz="0" w:val="nil"/>
-          <w:left w:space="0" w:sz="0" w:val="nil"/>
-          <w:bottom w:space="0" w:sz="0" w:val="nil"/>
-          <w:right w:space="0" w:sz="0" w:val="nil"/>
-          <w:between w:space="0" w:sz="0" w:val="nil"/>
-        </w:pBdr>
-        <w:shd w:fill="auto" w:val="clear"/>
-        <w:spacing w:after="0" w:before="0" w:line="276" w:lineRule="auto"/>
-        <w:ind w:left="0" w:right="0" w:firstLine="0"/>
-        <w:jc w:val="left"/>
-        <w:rPr>
-          <w:rFonts w:ascii="Calibri" w:cs="Calibri" w:eastAsia="Calibri" w:hAnsi="Calibri"/>
-          <w:b w:val="1"/>
-          <w:bCs w:val="1"/>
-        </w:rPr>
-      </w:pPr>
-      <w:r>
-        <w:rPr>
-          <w:rFonts w:ascii="Calibri" w:cs="Calibri" w:eastAsia="Calibri" w:hAnsi="Calibri"/>
-          <w:rtl w:val="0"/>
-        </w:rPr>
-        <w:t xml:space="preserve">2: </w:t>
-      </w:r>
-      <w:r>
-        <w:rPr>
-          <w:rFonts w:ascii="Calibri" w:cs="Calibri" w:eastAsia="Calibri" w:hAnsi="Calibri"/>
-          <w:b w:val="1"/>
-          <w:bCs w:val="1"/>
-          <w:rtl w:val="0"/>
-        </w:rPr>
-        <w:t xml:space="preserve">Ja, matig</w:t>
-      </w:r>
-    </w:p>
-    <w:p>
-      <w:pPr>
-        <w:keepNext w:val="0"/>
-        <w:keepLines w:val="0"/>
-        <w:pageBreakBefore w:val="0"/>
-        <w:widowControl w:val="1"/>
-        <w:pBdr>
-          <w:top w:space="0" w:sz="0" w:val="nil"/>
-          <w:left w:space="0" w:sz="0" w:val="nil"/>
-          <w:bottom w:space="0" w:sz="0" w:val="nil"/>
-          <w:right w:space="0" w:sz="0" w:val="nil"/>
-          <w:between w:space="0" w:sz="0" w:val="nil"/>
-        </w:pBdr>
-        <w:shd w:fill="auto" w:val="clear"/>
-        <w:spacing w:after="0" w:before="0" w:line="276" w:lineRule="auto"/>
-        <w:ind w:left="0" w:right="0" w:firstLine="0"/>
-        <w:jc w:val="left"/>
-        <w:rPr>
-          <w:rFonts w:ascii="Calibri" w:cs="Calibri" w:eastAsia="Calibri" w:hAnsi="Calibri"/>
-          <w:b w:val="1"/>
-          <w:bCs w:val="1"/>
-        </w:rPr>
-      </w:pPr>
-      <w:r>
-        <w:rPr>
-          <w:rFonts w:ascii="Calibri" w:cs="Calibri" w:eastAsia="Calibri" w:hAnsi="Calibri"/>
-          <w:rtl w:val="0"/>
-        </w:rPr>
-        <w:t xml:space="preserve">3: </w:t>
-      </w:r>
-      <w:r>
-        <w:rPr>
-          <w:rFonts w:ascii="Calibri" w:cs="Calibri" w:eastAsia="Calibri" w:hAnsi="Calibri"/>
-          <w:b w:val="1"/>
-          <w:bCs w:val="1"/>
-          <w:rtl w:val="0"/>
-        </w:rPr>
-        <w:t xml:space="preserve">Ja, weinig</w:t>
-      </w:r>
-    </w:p>
-    <w:p>
-      <w:pPr>
-        <w:keepNext w:val="0"/>
-        <w:keepLines w:val="0"/>
-        <w:pageBreakBefore w:val="0"/>
-        <w:widowControl w:val="1"/>
-        <w:pBdr>
-          <w:top w:space="0" w:sz="0" w:val="nil"/>
-          <w:left w:space="0" w:sz="0" w:val="nil"/>
-          <w:bottom w:space="0" w:sz="0" w:val="nil"/>
-          <w:right w:space="0" w:sz="0" w:val="nil"/>
-          <w:between w:space="0" w:sz="0" w:val="nil"/>
-        </w:pBdr>
-        <w:shd w:fill="auto" w:val="clear"/>
-        <w:spacing w:after="0" w:before="0" w:line="276" w:lineRule="auto"/>
-        <w:ind w:left="0" w:right="0" w:firstLine="0"/>
-        <w:jc w:val="left"/>
-        <w:rPr>
-          <w:rFonts w:ascii="Calibri" w:cs="Calibri" w:eastAsia="Calibri" w:hAnsi="Calibri"/>
-          <w:b w:val="1"/>
-          <w:bCs w:val="1"/>
-        </w:rPr>
-      </w:pPr>
-      <w:r>
-        <w:rPr>
-          <w:rFonts w:ascii="Calibri" w:cs="Calibri" w:eastAsia="Calibri" w:hAnsi="Calibri"/>
-          <w:rtl w:val="0"/>
-        </w:rPr>
-        <w:t xml:space="preserve">4: </w:t>
-      </w:r>
-      <w:r>
-        <w:rPr>
-          <w:rFonts w:ascii="Calibri" w:cs="Calibri" w:eastAsia="Calibri" w:hAnsi="Calibri"/>
-          <w:b w:val="1"/>
-          <w:bCs w:val="1"/>
-          <w:rtl w:val="0"/>
-        </w:rPr>
-        <w:t xml:space="preserve">Nee, geen deformed wings waargenomen</w:t>
       </w:r>
     </w:p>
     <w:p>

</xml_diff>